<commit_message>
OE3 deliverable republished with the design round of 08/10 (INC-137 to INC-145)
src/ follows the current prototype: maze with one amber backdrop and equal
frames (figure 4.7 recaptured), dialogue box, camera that follows the raft,
fire glow, Algoritm in parts with Wave, credits, main menu and level select
(figures 7.1 and 7.2 recaptured), Papá's elbow, and the sprite production with
the hired collaborator in CLIP Studio (Annex E, methodology, interface).
Chapter 9 and Annex F carry the full suite of 09/10/2026 on eb9be13/123785e
with its date; executable figures stay those of rc2, since the round built no
candidate. Annex A regenerated with rf_matrix.py --worktree: 857 methods, 416
citing a requirement, 47 of 47 RF covered. build.py --publish: all guards pass.
</commit_message>
<xml_diff>
--- a/docs/anexos oe3/Solucion_OE3_Anexo_B_Slice_1.docx
+++ b/docs/anexos oe3/Solucion_OE3_Anexo_B_Slice_1.docx
@@ -24,7 +24,7 @@
       <w:r>
         <w:fldChar w:fldCharType="separate"/>
       </w:r>
-      <w:hyperlink w:anchor="_Toc242202663" w:history="1">
+      <w:hyperlink w:anchor="_Toc242400565" w:history="1">
         <w:r>
           <w:rPr>
             <w:rStyle w:val="Hipervnculo"/>
@@ -51,7 +51,7 @@
             <w:noProof/>
             <w:webHidden/>
           </w:rPr>
-          <w:instrText xml:space="preserve"> PAGEREF _Toc242202663 \h </w:instrText>
+          <w:instrText xml:space="preserve"> PAGEREF _Toc242400565 \h </w:instrText>
         </w:r>
         <w:r>
           <w:rPr>
@@ -95,7 +95,7 @@
           <w14:ligatures w14:val="standardContextual"/>
         </w:rPr>
       </w:pPr>
-      <w:hyperlink w:anchor="_Toc242202664" w:history="1">
+      <w:hyperlink w:anchor="_Toc242400566" w:history="1">
         <w:r>
           <w:rPr>
             <w:rStyle w:val="Hipervnculo"/>
@@ -122,7 +122,7 @@
             <w:noProof/>
             <w:webHidden/>
           </w:rPr>
-          <w:instrText xml:space="preserve"> PAGEREF _Toc242202664 \h </w:instrText>
+          <w:instrText xml:space="preserve"> PAGEREF _Toc242400566 \h </w:instrText>
         </w:r>
         <w:r>
           <w:rPr>
@@ -166,7 +166,7 @@
           <w14:ligatures w14:val="standardContextual"/>
         </w:rPr>
       </w:pPr>
-      <w:hyperlink w:anchor="_Toc242202665" w:history="1">
+      <w:hyperlink w:anchor="_Toc242400567" w:history="1">
         <w:r>
           <w:rPr>
             <w:rStyle w:val="Hipervnculo"/>
@@ -193,7 +193,7 @@
             <w:noProof/>
             <w:webHidden/>
           </w:rPr>
-          <w:instrText xml:space="preserve"> PAGEREF _Toc242202665 \h </w:instrText>
+          <w:instrText xml:space="preserve"> PAGEREF _Toc242400567 \h </w:instrText>
         </w:r>
         <w:r>
           <w:rPr>
@@ -237,7 +237,7 @@
           <w14:ligatures w14:val="standardContextual"/>
         </w:rPr>
       </w:pPr>
-      <w:hyperlink w:anchor="_Toc242202666" w:history="1">
+      <w:hyperlink w:anchor="_Toc242400568" w:history="1">
         <w:r>
           <w:rPr>
             <w:rStyle w:val="Hipervnculo"/>
@@ -264,7 +264,7 @@
             <w:noProof/>
             <w:webHidden/>
           </w:rPr>
-          <w:instrText xml:space="preserve"> PAGEREF _Toc242202666 \h </w:instrText>
+          <w:instrText xml:space="preserve"> PAGEREF _Toc242400568 \h </w:instrText>
         </w:r>
         <w:r>
           <w:rPr>
@@ -308,7 +308,7 @@
           <w14:ligatures w14:val="standardContextual"/>
         </w:rPr>
       </w:pPr>
-      <w:hyperlink w:anchor="_Toc242202667" w:history="1">
+      <w:hyperlink w:anchor="_Toc242400569" w:history="1">
         <w:r>
           <w:rPr>
             <w:rStyle w:val="Hipervnculo"/>
@@ -335,7 +335,7 @@
             <w:noProof/>
             <w:webHidden/>
           </w:rPr>
-          <w:instrText xml:space="preserve"> PAGEREF _Toc242202667 \h </w:instrText>
+          <w:instrText xml:space="preserve"> PAGEREF _Toc242400569 \h </w:instrText>
         </w:r>
         <w:r>
           <w:rPr>
@@ -379,7 +379,7 @@
           <w14:ligatures w14:val="standardContextual"/>
         </w:rPr>
       </w:pPr>
-      <w:hyperlink w:anchor="_Toc242202668" w:history="1">
+      <w:hyperlink w:anchor="_Toc242400570" w:history="1">
         <w:r>
           <w:rPr>
             <w:rStyle w:val="Hipervnculo"/>
@@ -406,7 +406,7 @@
             <w:noProof/>
             <w:webHidden/>
           </w:rPr>
-          <w:instrText xml:space="preserve"> PAGEREF _Toc242202668 \h </w:instrText>
+          <w:instrText xml:space="preserve"> PAGEREF _Toc242400570 \h </w:instrText>
         </w:r>
         <w:r>
           <w:rPr>
@@ -450,7 +450,7 @@
           <w14:ligatures w14:val="standardContextual"/>
         </w:rPr>
       </w:pPr>
-      <w:hyperlink w:anchor="_Toc242202669" w:history="1">
+      <w:hyperlink w:anchor="_Toc242400571" w:history="1">
         <w:r>
           <w:rPr>
             <w:rStyle w:val="Hipervnculo"/>
@@ -477,7 +477,7 @@
             <w:noProof/>
             <w:webHidden/>
           </w:rPr>
-          <w:instrText xml:space="preserve"> PAGEREF _Toc242202669 \h </w:instrText>
+          <w:instrText xml:space="preserve"> PAGEREF _Toc242400571 \h </w:instrText>
         </w:r>
         <w:r>
           <w:rPr>
@@ -522,7 +522,7 @@
       <w:pPr>
         <w:pStyle w:val="Ttulo1"/>
       </w:pPr>
-      <w:bookmarkStart w:id="0" w:name="_Toc242202663"/>
+      <w:bookmarkStart w:id="0" w:name="_Toc242400565"/>
       <w:r>
         <w:lastRenderedPageBreak/>
         <w:t>ANEXO B. SLICE 1: RUTA PRINCIPAL Y NIVEL 1 «LA OSCURIDAD»</w:t>
@@ -565,7 +565,7 @@
       <w:pPr>
         <w:pStyle w:val="Ttulo2"/>
       </w:pPr>
-      <w:bookmarkStart w:id="1" w:name="_Toc242202664"/>
+      <w:bookmarkStart w:id="1" w:name="_Toc242400566"/>
       <w:r>
         <w:t>1. Alcance y seguimiento</w:t>
       </w:r>
@@ -2327,7 +2327,7 @@
       <w:pPr>
         <w:pStyle w:val="Ttulo2"/>
       </w:pPr>
-      <w:bookmarkStart w:id="2" w:name="_Toc242202665"/>
+      <w:bookmarkStart w:id="2" w:name="_Toc242400567"/>
       <w:r>
         <w:t>2. Lo implementado</w:t>
       </w:r>
@@ -4885,7 +4885,7 @@
       <w:pPr>
         <w:pStyle w:val="Ttulo2"/>
       </w:pPr>
-      <w:bookmarkStart w:id="3" w:name="_Toc242202666"/>
+      <w:bookmarkStart w:id="3" w:name="_Toc242400568"/>
       <w:r>
         <w:t>3. Decisiones de diseño y hallazgos de consistencia</w:t>
       </w:r>
@@ -6224,7 +6224,7 @@
       <w:pPr>
         <w:pStyle w:val="Ttulo2"/>
       </w:pPr>
-      <w:bookmarkStart w:id="4" w:name="_Toc242202667"/>
+      <w:bookmarkStart w:id="4" w:name="_Toc242400569"/>
       <w:r>
         <w:t>4. Verificación</w:t>
       </w:r>
@@ -10642,7 +10642,7 @@
       <w:pPr>
         <w:pStyle w:val="Ttulo2"/>
       </w:pPr>
-      <w:bookmarkStart w:id="5" w:name="_Toc242202668"/>
+      <w:bookmarkStart w:id="5" w:name="_Toc242400570"/>
       <w:r>
         <w:t>5. Archivos principales</w:t>
       </w:r>
@@ -12155,7 +12155,7 @@
       <w:pPr>
         <w:pStyle w:val="Ttulo2"/>
       </w:pPr>
-      <w:bookmarkStart w:id="6" w:name="_Toc242202669"/>
+      <w:bookmarkStart w:id="6" w:name="_Toc242400571"/>
       <w:r>
         <w:t>6. Evaluación del OE4 y verificaciones a cargo de Santiago Benavides Rey</w:t>
       </w:r>
@@ -12382,7 +12382,7 @@
   <w:abstractNum w:abstractNumId="0" w15:restartNumberingAfterBreak="0">
     <w:nsid w:val="0000A990"/>
     <w:multiLevelType w:val="multilevel"/>
-    <w:tmpl w:val="8CC4B92E"/>
+    <w:tmpl w:val="3F588082"/>
     <w:lvl w:ilvl="0">
       <w:numFmt w:val="bullet"/>
       <w:lvlText w:val=" "/>
@@ -12459,7 +12459,7 @@
   <w:abstractNum w:abstractNumId="1" w15:restartNumberingAfterBreak="0">
     <w:nsid w:val="0000A991"/>
     <w:multiLevelType w:val="multilevel"/>
-    <w:tmpl w:val="9F6C9326"/>
+    <w:tmpl w:val="FDB0FB9C"/>
     <w:lvl w:ilvl="0">
       <w:numFmt w:val="bullet"/>
       <w:lvlText w:val=""/>
@@ -12759,19 +12759,19 @@
       </w:pPr>
     </w:lvl>
   </w:abstractNum>
-  <w:num w:numId="1" w16cid:durableId="1619527212">
+  <w:num w:numId="1" w16cid:durableId="1789003190">
     <w:abstractNumId w:val="2"/>
   </w:num>
-  <w:num w:numId="2" w16cid:durableId="1359887527">
+  <w:num w:numId="2" w16cid:durableId="735393224">
     <w:abstractNumId w:val="3"/>
     <w:lvlOverride w:ilvl="0">
       <w:startOverride w:val="1"/>
     </w:lvlOverride>
   </w:num>
-  <w:num w:numId="3" w16cid:durableId="1857844438">
+  <w:num w:numId="3" w16cid:durableId="1882667106">
     <w:abstractNumId w:val="0"/>
   </w:num>
-  <w:num w:numId="4" w16cid:durableId="384842291">
+  <w:num w:numId="4" w16cid:durableId="1664577380">
     <w:abstractNumId w:val="1"/>
   </w:num>
 </w:numbering>
@@ -13577,7 +13577,7 @@
     <w:link w:val="EncabezadoCar"/>
     <w:uiPriority w:val="99"/>
     <w:unhideWhenUsed/>
-    <w:rsid w:val="00097E40"/>
+    <w:rsid w:val="005A04A5"/>
     <w:pPr>
       <w:tabs>
         <w:tab w:val="center" w:pos="4419"/>
@@ -13591,7 +13591,7 @@
     <w:basedOn w:val="Fuentedeprrafopredeter"/>
     <w:link w:val="Encabezado"/>
     <w:uiPriority w:val="99"/>
-    <w:rsid w:val="00097E40"/>
+    <w:rsid w:val="005A04A5"/>
   </w:style>
   <w:style w:type="paragraph" w:styleId="Piedepgina">
     <w:name w:val="footer"/>
@@ -13599,7 +13599,7 @@
     <w:link w:val="PiedepginaCar"/>
     <w:uiPriority w:val="99"/>
     <w:unhideWhenUsed/>
-    <w:rsid w:val="00097E40"/>
+    <w:rsid w:val="005A04A5"/>
     <w:pPr>
       <w:tabs>
         <w:tab w:val="center" w:pos="4419"/>
@@ -13613,7 +13613,7 @@
     <w:basedOn w:val="Fuentedeprrafopredeter"/>
     <w:link w:val="Piedepgina"/>
     <w:uiPriority w:val="99"/>
-    <w:rsid w:val="00097E40"/>
+    <w:rsid w:val="005A04A5"/>
   </w:style>
   <w:style w:type="character" w:styleId="Nmerodepgina">
     <w:name w:val="page number"/>
@@ -13621,7 +13621,7 @@
     <w:uiPriority w:val="99"/>
     <w:semiHidden/>
     <w:unhideWhenUsed/>
-    <w:rsid w:val="00097E40"/>
+    <w:rsid w:val="005A04A5"/>
   </w:style>
 </w:styles>
 </file>

</xml_diff>